<commit_message>
SH-QP-018 초안: 7.4 가정 3건 확정
Co-Authored-By: Claude Sonnet 5.5 <noreply@anthropic.com>
Claude-Session: https://claude.ai/code/session_01GQz9uTQwadYt8HmKMptZzn
</commit_message>
<xml_diff>
--- a/SHINHWA_QMS_WORKFLOW/03_EDIT/AUTO_DRAFT/SH-QP-018_식별및추적성관리절차서_Rev03_DRAFT.docx
+++ b/SHINHWA_QMS_WORKFLOW/03_EDIT/AUTO_DRAFT/SH-QP-018_식별및추적성관리절차서_Rev03_DRAFT.docx
@@ -1552,7 +1552,7 @@
         <w:rPr>
           <w:b w:val="0"/>
         </w:rPr>
-        <w:t xml:space="preserve">을 보낸다(사용자 확인 2026-10-06; 알림 대상 담당자는 7.4의 품질팀 담당자로 가정, 알림 수단은 </w:t>
+        <w:t xml:space="preserve">을 보낸다(사용자 확인 2026-10-06; 알림 대상 담당자는 7.4의 품질팀 담당자이며, 알림 수단은 </w:t>
       </w:r>
       <w:r>
         <w:rPr>
@@ -1576,7 +1576,7 @@
         <w:rPr>
           <w:b w:val="0"/>
         </w:rPr>
-        <w:t xml:space="preserve"> 완료한다(사용자 확인 2026-10-06; 달력일 기준 가정). 기한 안에 재실행이 불가능하면 </w:t>
+        <w:t xml:space="preserve"> 완료한다(사용자 확인 2026-10-06; 달력일 기준). 기한 안에 재실행이 불가능하면 </w:t>
       </w:r>
       <w:r>
         <w:rPr>
@@ -1818,7 +1818,7 @@
               <w:rPr>
                 <w:b w:val="0"/>
               </w:rPr>
-              <w:t>(사용자 확인 2026-10-06; 달력일은 다른 기한과 동일 기준 가정, 확인 필요). 이에 따라 작성 후 최대 4일 안에 스캔·서버 저장이 끝난다.</w:t>
+              <w:t>(사용자 확인 2026-10-06; 달력일 기준). 이에 따라 작성 후 최대 4일 안에 스캔·서버 저장이 끝난다.</w:t>
             </w:r>
           </w:p>
         </w:tc>

</xml_diff>